<commit_message>
login de Admin terminado 2
</commit_message>
<xml_diff>
--- a/Proyecto Fuengirola 1.docx
+++ b/Proyecto Fuengirola 1.docx
@@ -109,13 +109,7 @@
         <w:rPr>
           <w:lang w:val="en-US"/>
         </w:rPr>
-        <w:t>seed</w:t>
-      </w:r>
-      <w:r>
-        <w:rPr>
-          <w:lang w:val="en-US"/>
-        </w:rPr>
-        <w:t xml:space="preserve">  (</w:t>
+        <w:t>seed  (</w:t>
       </w:r>
       <w:proofErr w:type="spellStart"/>
       <w:proofErr w:type="gramEnd"/>
@@ -732,6 +726,7 @@
         <w:pStyle w:val="Ttulo2"/>
       </w:pPr>
       <w:r>
+        <w:lastRenderedPageBreak/>
         <w:t xml:space="preserve">Modelo </w:t>
       </w:r>
       <w:proofErr w:type="spellStart"/>
@@ -876,12 +871,12 @@
     <w:p>
       <w:pPr>
         <w:rPr>
-          <w:lang w:val="en-US"/>
-        </w:rPr>
-      </w:pPr>
-      <w:r>
-        <w:rPr>
-          <w:lang w:val="en-US"/>
+          <w:lang w:val="es-ES"/>
+        </w:rPr>
+      </w:pPr>
+      <w:r>
+        <w:rPr>
+          <w:lang w:val="es-ES"/>
         </w:rPr>
         <w:t>}</w:t>
       </w:r>
@@ -890,44 +885,36 @@
       <w:pPr>
         <w:pStyle w:val="Ttulo3"/>
         <w:rPr>
-          <w:lang w:val="en-US"/>
-        </w:rPr>
-      </w:pPr>
-      <w:proofErr w:type="spellStart"/>
-      <w:r>
-        <w:rPr>
-          <w:lang w:val="en-US"/>
+          <w:lang w:val="es-ES"/>
+        </w:rPr>
+      </w:pPr>
+      <w:proofErr w:type="spellStart"/>
+      <w:r>
+        <w:rPr>
+          <w:lang w:val="es-ES"/>
         </w:rPr>
         <w:t>Metodo</w:t>
       </w:r>
       <w:proofErr w:type="spellEnd"/>
       <w:r>
         <w:rPr>
-          <w:lang w:val="en-US"/>
+          <w:lang w:val="es-ES"/>
         </w:rPr>
         <w:t xml:space="preserve"> </w:t>
       </w:r>
       <w:proofErr w:type="spellStart"/>
-      <w:proofErr w:type="gramStart"/>
-      <w:r>
-        <w:rPr>
-          <w:lang w:val="en-US"/>
+      <w:r>
+        <w:rPr>
+          <w:lang w:val="es-ES"/>
         </w:rPr>
         <w:t>allTeams</w:t>
       </w:r>
       <w:proofErr w:type="spellEnd"/>
       <w:r>
         <w:rPr>
-          <w:lang w:val="en-US"/>
-        </w:rPr>
-        <w:t>(</w:t>
-      </w:r>
-      <w:proofErr w:type="gramEnd"/>
-      <w:r>
-        <w:rPr>
-          <w:lang w:val="en-US"/>
-        </w:rPr>
-        <w:t xml:space="preserve">) </w:t>
+          <w:lang w:val="es-ES"/>
+        </w:rPr>
+        <w:t xml:space="preserve">() </w:t>
       </w:r>
     </w:p>
     <w:p>
@@ -1451,7 +1438,23 @@
           <w:rStyle w:val="hljs-comment"/>
           <w:rFonts w:eastAsiaTheme="majorEastAsia"/>
         </w:rPr>
-        <w:t>// Jetstream proporciona este método</w:t>
+        <w:t xml:space="preserve">// </w:t>
+      </w:r>
+      <w:proofErr w:type="spellStart"/>
+      <w:r>
+        <w:rPr>
+          <w:rStyle w:val="hljs-comment"/>
+          <w:rFonts w:eastAsiaTheme="majorEastAsia"/>
+        </w:rPr>
+        <w:t>Jetstream</w:t>
+      </w:r>
+      <w:proofErr w:type="spellEnd"/>
+      <w:r>
+        <w:rPr>
+          <w:rStyle w:val="hljs-comment"/>
+          <w:rFonts w:eastAsiaTheme="majorEastAsia"/>
+        </w:rPr>
+        <w:t xml:space="preserve"> proporciona este método</w:t>
       </w:r>
     </w:p>
     <w:p>
@@ -1537,7 +1540,14 @@
         <w:rPr>
           <w:lang w:val="es-ES"/>
         </w:rPr>
-        <w:t>. Este campo es lo que Jetstream utiliza para asignar roles de forma básica, permitiéndote definir permisos para cada usuario en un equipo. Sin embargo, si deseas una implementación de roles más detallada, aquí te explico cómo puedes gestionar roles en Jetstream o expandir su funcionalidad.</w:t>
+        <w:t xml:space="preserve">. Este campo es lo que Jetstream utiliza para asignar roles </w:t>
+      </w:r>
+      <w:r>
+        <w:rPr>
+          <w:lang w:val="es-ES"/>
+        </w:rPr>
+        <w:lastRenderedPageBreak/>
+        <w:t>de forma básica, permitiéndote definir permisos para cada usuario en un equipo. Sin embargo, si deseas una implementación de roles más detallada, aquí te explico cómo puedes gestionar roles en Jetstream o expandir su funcionalidad.</w:t>
       </w:r>
     </w:p>
     <w:p>
@@ -2020,6 +2030,7 @@
         <w:rPr>
           <w:lang w:val="es-ES"/>
         </w:rPr>
+        <w:lastRenderedPageBreak/>
         <w:t>}</w:t>
       </w:r>
     </w:p>
@@ -2608,6 +2619,7 @@
           <w:bCs/>
           <w:lang w:val="es-ES"/>
         </w:rPr>
+        <w:lastRenderedPageBreak/>
         <w:t xml:space="preserve">Uso del paquete Laravel </w:t>
       </w:r>
       <w:proofErr w:type="spellStart"/>
@@ -3130,41 +3142,45 @@
     <w:p>
       <w:pPr>
         <w:rPr>
-          <w:lang w:val="en-US"/>
-        </w:rPr>
-      </w:pPr>
-      <w:r>
-        <w:rPr>
-          <w:lang w:val="en-US"/>
-        </w:rPr>
-        <w:t xml:space="preserve">    use </w:t>
-      </w:r>
-      <w:proofErr w:type="spellStart"/>
-      <w:proofErr w:type="gramStart"/>
-      <w:r>
-        <w:rPr>
-          <w:lang w:val="en-US"/>
+          <w:lang w:val="es-ES"/>
+        </w:rPr>
+      </w:pPr>
+      <w:r>
+        <w:rPr>
+          <w:lang w:val="en-US"/>
+        </w:rPr>
+        <w:t xml:space="preserve">    </w:t>
+      </w:r>
+      <w:r>
+        <w:rPr>
+          <w:lang w:val="es-ES"/>
+        </w:rPr>
+        <w:t xml:space="preserve">use </w:t>
+      </w:r>
+      <w:proofErr w:type="spellStart"/>
+      <w:r>
+        <w:rPr>
+          <w:lang w:val="es-ES"/>
         </w:rPr>
         <w:t>HasRoles</w:t>
       </w:r>
       <w:proofErr w:type="spellEnd"/>
       <w:r>
         <w:rPr>
-          <w:lang w:val="en-US"/>
+          <w:lang w:val="es-ES"/>
         </w:rPr>
         <w:t>;</w:t>
       </w:r>
-      <w:proofErr w:type="gramEnd"/>
-    </w:p>
-    <w:p>
-      <w:pPr>
-        <w:rPr>
-          <w:lang w:val="es-ES"/>
-        </w:rPr>
-      </w:pPr>
-      <w:r>
-        <w:rPr>
-          <w:lang w:val="en-US"/>
+    </w:p>
+    <w:p>
+      <w:pPr>
+        <w:rPr>
+          <w:lang w:val="es-ES"/>
+        </w:rPr>
+      </w:pPr>
+      <w:r>
+        <w:rPr>
+          <w:lang w:val="es-ES"/>
         </w:rPr>
         <w:t xml:space="preserve">    </w:t>
       </w:r>
@@ -4277,6 +4293,7 @@
           <w:lang w:val="es-ES" w:eastAsia="es-ES"/>
           <w14:ligatures w14:val="none"/>
         </w:rPr>
+        <w:lastRenderedPageBreak/>
         <w:t>Funcionamiento del Sistema:</w:t>
       </w:r>
     </w:p>
@@ -4435,7 +4452,27 @@
           <w:lang w:val="es-ES" w:eastAsia="es-ES"/>
           <w14:ligatures w14:val="none"/>
         </w:rPr>
-        <w:t>Con esta arquitectura, lograrás flexibilidad y escalabilidad en la asignación de permisos y propiedad, preservando la integridad de la configuración de Jetstream.</w:t>
+        <w:t xml:space="preserve">Con esta arquitectura, </w:t>
+      </w:r>
+      <w:r>
+        <w:rPr>
+          <w:rFonts w:ascii="Times New Roman" w:eastAsia="Times New Roman" w:hAnsi="Times New Roman" w:cs="Times New Roman"/>
+          <w:kern w:val="0"/>
+          <w:szCs w:val="24"/>
+          <w:lang w:val="es-ES" w:eastAsia="es-ES"/>
+          <w14:ligatures w14:val="none"/>
+        </w:rPr>
+        <w:t>logramos</w:t>
+      </w:r>
+      <w:r>
+        <w:rPr>
+          <w:rFonts w:ascii="Times New Roman" w:eastAsia="Times New Roman" w:hAnsi="Times New Roman" w:cs="Times New Roman"/>
+          <w:kern w:val="0"/>
+          <w:szCs w:val="24"/>
+          <w:lang w:val="es-ES" w:eastAsia="es-ES"/>
+          <w14:ligatures w14:val="none"/>
+        </w:rPr>
+        <w:t xml:space="preserve"> flexibilidad y escalabilidad en la asignación de permisos y propiedad, preservando la integridad de la configuración de Jetstream.</w:t>
       </w:r>
     </w:p>
     <w:p>
@@ -7087,6 +7124,7 @@
   <w:style w:type="character" w:default="1" w:styleId="Fuentedeprrafopredeter">
     <w:name w:val="Default Paragraph Font"/>
     <w:uiPriority w:val="1"/>
+    <w:semiHidden/>
     <w:unhideWhenUsed/>
   </w:style>
   <w:style w:type="table" w:default="1" w:styleId="Tablanormal">

</xml_diff>